<commit_message>
subida bases y consultas
</commit_message>
<xml_diff>
--- a/EJERCICIOS DE LOS ALUMNOS/JUAN ANTONIO/SQL/EJERCICIOS DE CONSULTAS SOBRE UNA TABLA 02.docx
+++ b/EJERCICIOS DE LOS ALUMNOS/JUAN ANTONIO/SQL/EJERCICIOS DE CONSULTAS SOBRE UNA TABLA 02.docx
@@ -2,7 +2,254 @@
 <file path=word/document.xml><?xml version="1.0" encoding="utf-8"?>
 <w:document xmlns:wpc="http://schemas.microsoft.com/office/word/2010/wordprocessingCanvas" xmlns:cx="http://schemas.microsoft.com/office/drawing/2014/chartex" xmlns:cx1="http://schemas.microsoft.com/office/drawing/2015/9/8/chartex" xmlns:cx2="http://schemas.microsoft.com/office/drawing/2015/10/21/chartex" xmlns:cx3="http://schemas.microsoft.com/office/drawing/2016/5/9/chartex" xmlns:cx4="http://schemas.microsoft.com/office/drawing/2016/5/10/chartex" xmlns:cx5="http://schemas.microsoft.com/office/drawing/2016/5/11/chartex" xmlns:cx6="http://schemas.microsoft.com/office/drawing/2016/5/12/chartex" xmlns:cx7="http://schemas.microsoft.com/office/drawing/2016/5/13/chartex" xmlns:cx8="http://schemas.microsoft.com/office/drawing/2016/5/14/chartex" xmlns:mc="http://schemas.openxmlformats.org/markup-compatibility/2006" xmlns:aink="http://schemas.microsoft.com/office/drawing/2016/ink" xmlns:am3d="http://schemas.microsoft.com/office/drawing/2017/model3d" xmlns:o="urn:schemas-microsoft-com:office:office" xmlns:oel="http://schemas.microsoft.com/office/2019/extlst" xmlns:r="http://schemas.openxmlformats.org/officeDocument/2006/relationships" xmlns:m="http://schemas.openxmlformats.org/officeDocument/2006/math" xmlns:v="urn:schemas-microsoft-com:vml" xmlns:wp14="http://schemas.microsoft.com/office/word/2010/wordprocessingDrawing" xmlns:wp="http://schemas.openxmlformats.org/drawingml/2006/wordprocessingDrawing" xmlns:w10="urn:schemas-microsoft-com:office:word" xmlns:w="http://schemas.openxmlformats.org/wordprocessingml/2006/main" xmlns:w14="http://schemas.microsoft.com/office/word/2010/wordml" xmlns:w15="http://schemas.microsoft.com/office/word/2012/wordml" xmlns:w16cex="http://schemas.microsoft.com/office/word/2018/wordml/cex" xmlns:w16cid="http://schemas.microsoft.com/office/word/2016/wordml/cid" xmlns:w16="http://schemas.microsoft.com/office/word/2018/wordml" xmlns:w16du="http://schemas.microsoft.com/office/word/2023/wordml/word16du" xmlns:w16sdtdh="http://schemas.microsoft.com/office/word/2020/wordml/sdtdatahash" xmlns:w16sdtfl="http://schemas.microsoft.com/office/word/2024/wordml/sdtformatlock" xmlns:w16se="http://schemas.microsoft.com/office/word/2015/wordml/symex" xmlns:wpg="http://schemas.microsoft.com/office/word/2010/wordprocessingGroup" xmlns:wpi="http://schemas.microsoft.com/office/word/2010/wordprocessingInk" xmlns:wne="http://schemas.microsoft.com/office/word/2006/wordml" xmlns:wps="http://schemas.microsoft.com/office/word/2010/wordprocessingShape" mc:Ignorable="w14 w15 w16se w16cid w16 w16cex w16sdtdh w16sdtfl w16du wp14">
   <w:body>
+    <w:p>
+      <w:pPr>
+        <w:rPr>
+          <w:b/>
+          <w:bCs/>
+        </w:rPr>
+      </w:pPr>
+      <w:r>
+        <w:rPr>
+          <w:b/>
+          <w:bCs/>
+        </w:rPr>
+        <w:t>EJERCICIOS DE CONSULTAS SOBRE UNA TABLA 02</w:t>
+      </w:r>
+    </w:p>
+    <w:p>
+      <w:r>
+        <w:t>1) Lista el nombre de todos los productos que hay en la tabla producto.</w:t>
+      </w:r>
+    </w:p>
+    <w:p>
+      <w:r>
+        <w:drawing>
+          <wp:inline distT="0" distB="0" distL="0" distR="0" wp14:anchorId="29D918A4" wp14:editId="089301AE">
+            <wp:extent cx="3086531" cy="4448796"/>
+            <wp:effectExtent l="0" t="0" r="0" b="9525"/>
+            <wp:docPr id="370822361" name="Imagen 1"/>
+            <wp:cNvGraphicFramePr>
+              <a:graphicFrameLocks xmlns:a="http://schemas.openxmlformats.org/drawingml/2006/main" noChangeAspect="1"/>
+            </wp:cNvGraphicFramePr>
+            <a:graphic xmlns:a="http://schemas.openxmlformats.org/drawingml/2006/main">
+              <a:graphicData uri="http://schemas.openxmlformats.org/drawingml/2006/picture">
+                <pic:pic xmlns:pic="http://schemas.openxmlformats.org/drawingml/2006/picture">
+                  <pic:nvPicPr>
+                    <pic:cNvPr id="370822361" name=""/>
+                    <pic:cNvPicPr/>
+                  </pic:nvPicPr>
+                  <pic:blipFill>
+                    <a:blip r:embed="rId4"/>
+                    <a:stretch>
+                      <a:fillRect/>
+                    </a:stretch>
+                  </pic:blipFill>
+                  <pic:spPr>
+                    <a:xfrm>
+                      <a:off x="0" y="0"/>
+                      <a:ext cx="3086531" cy="4448796"/>
+                    </a:xfrm>
+                    <a:prstGeom prst="rect">
+                      <a:avLst/>
+                    </a:prstGeom>
+                  </pic:spPr>
+                </pic:pic>
+              </a:graphicData>
+            </a:graphic>
+          </wp:inline>
+        </w:drawing>
+      </w:r>
+    </w:p>
+    <w:p>
+      <w:r>
+        <w:t>2) Lista los nombres y los precios de todos los productos de la tabla producto.</w:t>
+      </w:r>
+    </w:p>
+    <w:p>
+      <w:r>
+        <w:drawing>
+          <wp:inline distT="0" distB="0" distL="0" distR="0" wp14:anchorId="7D23A48F" wp14:editId="100AA29A">
+            <wp:extent cx="3269974" cy="4054767"/>
+            <wp:effectExtent l="0" t="0" r="6985" b="3175"/>
+            <wp:docPr id="1387626640" name="Imagen 1"/>
+            <wp:cNvGraphicFramePr>
+              <a:graphicFrameLocks xmlns:a="http://schemas.openxmlformats.org/drawingml/2006/main" noChangeAspect="1"/>
+            </wp:cNvGraphicFramePr>
+            <a:graphic xmlns:a="http://schemas.openxmlformats.org/drawingml/2006/main">
+              <a:graphicData uri="http://schemas.openxmlformats.org/drawingml/2006/picture">
+                <pic:pic xmlns:pic="http://schemas.openxmlformats.org/drawingml/2006/picture">
+                  <pic:nvPicPr>
+                    <pic:cNvPr id="1387626640" name=""/>
+                    <pic:cNvPicPr/>
+                  </pic:nvPicPr>
+                  <pic:blipFill>
+                    <a:blip r:embed="rId5"/>
+                    <a:stretch>
+                      <a:fillRect/>
+                    </a:stretch>
+                  </pic:blipFill>
+                  <pic:spPr>
+                    <a:xfrm>
+                      <a:off x="0" y="0"/>
+                      <a:ext cx="3273132" cy="4058683"/>
+                    </a:xfrm>
+                    <a:prstGeom prst="rect">
+                      <a:avLst/>
+                    </a:prstGeom>
+                  </pic:spPr>
+                </pic:pic>
+              </a:graphicData>
+            </a:graphic>
+          </wp:inline>
+        </w:drawing>
+      </w:r>
+    </w:p>
+    <w:p>
+      <w:r>
+        <w:lastRenderedPageBreak/>
+        <w:t>3) Lista todas las columnas de la tabla producto.</w:t>
+      </w:r>
+    </w:p>
+    <w:p>
+      <w:r>
+        <w:drawing>
+          <wp:inline distT="0" distB="0" distL="0" distR="0" wp14:anchorId="04540884" wp14:editId="47E72AE2">
+            <wp:extent cx="5614372" cy="4313583"/>
+            <wp:effectExtent l="0" t="0" r="5715" b="0"/>
+            <wp:docPr id="442250658" name="Imagen 1"/>
+            <wp:cNvGraphicFramePr>
+              <a:graphicFrameLocks xmlns:a="http://schemas.openxmlformats.org/drawingml/2006/main" noChangeAspect="1"/>
+            </wp:cNvGraphicFramePr>
+            <a:graphic xmlns:a="http://schemas.openxmlformats.org/drawingml/2006/main">
+              <a:graphicData uri="http://schemas.openxmlformats.org/drawingml/2006/picture">
+                <pic:pic xmlns:pic="http://schemas.openxmlformats.org/drawingml/2006/picture">
+                  <pic:nvPicPr>
+                    <pic:cNvPr id="442250658" name=""/>
+                    <pic:cNvPicPr/>
+                  </pic:nvPicPr>
+                  <pic:blipFill>
+                    <a:blip r:embed="rId6"/>
+                    <a:stretch>
+                      <a:fillRect/>
+                    </a:stretch>
+                  </pic:blipFill>
+                  <pic:spPr>
+                    <a:xfrm>
+                      <a:off x="0" y="0"/>
+                      <a:ext cx="5626952" cy="4323248"/>
+                    </a:xfrm>
+                    <a:prstGeom prst="rect">
+                      <a:avLst/>
+                    </a:prstGeom>
+                  </pic:spPr>
+                </pic:pic>
+              </a:graphicData>
+            </a:graphic>
+          </wp:inline>
+        </w:drawing>
+      </w:r>
+    </w:p>
+    <w:p>
+      <w:r>
+        <w:t>4) Lista el nombre de los productos, el precio en euros y el precio en dólares estadounidenses</w:t>
+      </w:r>
+    </w:p>
+    <w:p>
+      <w:r>
+        <w:t>(USD).</w:t>
+      </w:r>
+    </w:p>
+    <w:p>
+      <w:r>
+        <w:drawing>
+          <wp:inline distT="0" distB="0" distL="0" distR="0" wp14:anchorId="6CFD75E5" wp14:editId="1456DB00">
+            <wp:extent cx="5242660" cy="3786808"/>
+            <wp:effectExtent l="0" t="0" r="0" b="4445"/>
+            <wp:docPr id="226530716" name="Imagen 1"/>
+            <wp:cNvGraphicFramePr>
+              <a:graphicFrameLocks xmlns:a="http://schemas.openxmlformats.org/drawingml/2006/main" noChangeAspect="1"/>
+            </wp:cNvGraphicFramePr>
+            <a:graphic xmlns:a="http://schemas.openxmlformats.org/drawingml/2006/main">
+              <a:graphicData uri="http://schemas.openxmlformats.org/drawingml/2006/picture">
+                <pic:pic xmlns:pic="http://schemas.openxmlformats.org/drawingml/2006/picture">
+                  <pic:nvPicPr>
+                    <pic:cNvPr id="226530716" name=""/>
+                    <pic:cNvPicPr/>
+                  </pic:nvPicPr>
+                  <pic:blipFill>
+                    <a:blip r:embed="rId7"/>
+                    <a:stretch>
+                      <a:fillRect/>
+                    </a:stretch>
+                  </pic:blipFill>
+                  <pic:spPr>
+                    <a:xfrm>
+                      <a:off x="0" y="0"/>
+                      <a:ext cx="5288057" cy="3819599"/>
+                    </a:xfrm>
+                    <a:prstGeom prst="rect">
+                      <a:avLst/>
+                    </a:prstGeom>
+                  </pic:spPr>
+                </pic:pic>
+              </a:graphicData>
+            </a:graphic>
+          </wp:inline>
+        </w:drawing>
+      </w:r>
+    </w:p>
     <w:p/>
+    <w:p>
+      <w:r>
+        <w:lastRenderedPageBreak/>
+        <w:t>5) Lista el nombre de los productos, el precio en euros y el precio en dólares estadounidenses</w:t>
+      </w:r>
+    </w:p>
+    <w:p>
+      <w:r>
+        <w:t>(USD). Utiliza los siguientes alias para las columnas: nombre de producto, euros, dólares.</w:t>
+      </w:r>
+    </w:p>
+    <w:p>
+      <w:r>
+        <w:drawing>
+          <wp:inline distT="0" distB="0" distL="0" distR="0" wp14:anchorId="52503A23" wp14:editId="6AD33BA3">
+            <wp:extent cx="4953691" cy="5220429"/>
+            <wp:effectExtent l="0" t="0" r="0" b="0"/>
+            <wp:docPr id="1153473495" name="Imagen 1"/>
+            <wp:cNvGraphicFramePr>
+              <a:graphicFrameLocks xmlns:a="http://schemas.openxmlformats.org/drawingml/2006/main" noChangeAspect="1"/>
+            </wp:cNvGraphicFramePr>
+            <a:graphic xmlns:a="http://schemas.openxmlformats.org/drawingml/2006/main">
+              <a:graphicData uri="http://schemas.openxmlformats.org/drawingml/2006/picture">
+                <pic:pic xmlns:pic="http://schemas.openxmlformats.org/drawingml/2006/picture">
+                  <pic:nvPicPr>
+                    <pic:cNvPr id="1153473495" name=""/>
+                    <pic:cNvPicPr/>
+                  </pic:nvPicPr>
+                  <pic:blipFill>
+                    <a:blip r:embed="rId8"/>
+                    <a:stretch>
+                      <a:fillRect/>
+                    </a:stretch>
+                  </pic:blipFill>
+                  <pic:spPr>
+                    <a:xfrm>
+                      <a:off x="0" y="0"/>
+                      <a:ext cx="4953691" cy="5220429"/>
+                    </a:xfrm>
+                    <a:prstGeom prst="rect">
+                      <a:avLst/>
+                    </a:prstGeom>
+                  </pic:spPr>
+                </pic:pic>
+              </a:graphicData>
+            </a:graphic>
+          </wp:inline>
+        </w:drawing>
+      </w:r>
+    </w:p>
     <w:sectPr>
       <w:pgSz w:w="11906" w:h="16838"/>
       <w:pgMar w:top="720" w:right="720" w:bottom="720" w:left="720" w:header="708" w:footer="708" w:gutter="0"/>
@@ -616,7 +863,6 @@
   <w:style w:type="character" w:default="1" w:styleId="Fuentedeprrafopredeter">
     <w:name w:val="Default Paragraph Font"/>
     <w:uiPriority w:val="1"/>
-    <w:semiHidden/>
     <w:unhideWhenUsed/>
   </w:style>
   <w:style w:type="table" w:default="1" w:styleId="Tablanormal">

</xml_diff>